<commit_message>
barlow/finesst: lowercase lidar in biosketch (FI-approved), package now fully consistent
Co-Authored-By: Claude Fable 5 <noreply@anthropic.com>
</commit_message>
<xml_diff>
--- a/barlow/finesst_final/biosketch_FI_goodrich.docx
+++ b/barlow/finesst_final/biosketch_FI_goodrich.docx
@@ -373,7 +373,7 @@
           <w:i w:val="0"/>
           <w:sz w:val="22"/>
         </w:rPr>
-        <w:t>1. Goodrich, C. (2025). WellSight: An autonomous LiDAR analysis pipeline for detecting orphaned and abandoned oil &amp; gas wells [software]. Multi-task deep-learning system (U-Net, ~8M parameters) segmenting well pits, access roads, and well pads from LiDAR-derived rasters at 0.5–1 m resolution; integrates PDAL, WhiteboxTools, GDAL/Rasterio, and PyTorch. https://github.com/clgoodrich/lidar_project</w:t>
+        <w:t>1. Goodrich, C. (2025). WellSight: An autonomous lidar analysis pipeline for detecting orphaned and abandoned oil &amp; gas wells [software]. Multi-task deep-learning system (U-Net, ~8M parameters) segmenting well pits, access roads, and well pads from lidar-derived rasters at 0.5–1 m resolution; integrates PDAL, WhiteboxTools, GDAL/Rasterio, and PyTorch. https://github.com/clgoodrich/lidar_project</w:t>
       </w:r>
     </w:p>
     <w:p>
@@ -387,7 +387,7 @@
           <w:i w:val="0"/>
           <w:sz w:val="22"/>
         </w:rPr>
-        <w:t>2. Goodrich, C. (2025). SAOCOM L-band InSAR digital elevation model generation and validation framework [software/dataset]. P-SBAS time-series interferometry of SAOCOM-1A/1B data producing high-coherence, vegetation-penetrating DEMs; accuracy assessment (NMAD, RMSE, CORINE land-cover-stratified) against TINITALY LiDAR and Copernicus GLO-30, in support of the NASA Surface Topography and Vegetation (STV) Decadal Survey. https://github.com/clgoodrich/saocom_project</w:t>
+        <w:t>2. Goodrich, C. (2025). SAOCOM L-band InSAR digital elevation model generation and validation framework [software/dataset]. P-SBAS time-series interferometry of SAOCOM-1A/1B data producing high-coherence, vegetation-penetrating DEMs; accuracy assessment (NMAD, RMSE, CORINE land-cover-stratified) against TINITALY lidar and Copernicus GLO-30, in support of the NASA Surface Topography and Vegetation (STV) Decadal Survey. https://github.com/clgoodrich/saocom_project</w:t>
       </w:r>
     </w:p>
     <w:p>

</xml_diff>